<commit_message>
Fix duplicated ERD and clean Section 6
</commit_message>
<xml_diff>
--- a/Hotel_Management_System_Report.docx
+++ b/Hotel_Management_System_Report.docx
@@ -2388,14 +2388,14 @@
     </w:p>
     <w:p>
       <w:pPr>
-        <w:spacing w:before="200" w:after="120"/>
+        <w:spacing w:before="280" w:after="140"/>
         <w:jc w:val="center"/>
       </w:pPr>
       <w:r>
         <w:drawing>
           <wp:inline xmlns:a="http://schemas.openxmlformats.org/drawingml/2006/main" xmlns:pic="http://schemas.openxmlformats.org/drawingml/2006/picture">
-            <wp:extent cx="6446520" cy="4226052"/>
-            <wp:docPr id="2" name="Picture 2"/>
+            <wp:extent cx="6263640" cy="4541139"/>
+            <wp:docPr id="1" name="Picture 1"/>
             <wp:cNvGraphicFramePr>
               <a:graphicFrameLocks noChangeAspect="1"/>
             </wp:cNvGraphicFramePr>
@@ -2403,11 +2403,11 @@
               <a:graphicData uri="http://schemas.openxmlformats.org/drawingml/2006/picture">
                 <pic:pic>
                   <pic:nvPicPr>
-                    <pic:cNvPr id="0" name="image.png"/>
+                    <pic:cNvPr id="0" name="ER_Diagram_clean.png"/>
                     <pic:cNvPicPr/>
                   </pic:nvPicPr>
                   <pic:blipFill>
-                    <a:blip r:embed="rId11"/>
+                    <a:blip r:embed="rId12"/>
                     <a:stretch>
                       <a:fillRect/>
                     </a:stretch>
@@ -2415,7 +2415,7 @@
                   <pic:spPr>
                     <a:xfrm>
                       <a:off x="0" y="0"/>
-                      <a:ext cx="6446520" cy="4226052"/>
+                      <a:ext cx="6263640" cy="4541139"/>
                     </a:xfrm>
                     <a:prstGeom prst="rect"/>
                   </pic:spPr>
@@ -2428,7 +2428,6 @@
     </w:p>
     <w:p>
       <w:pPr>
-        <w:keepNext w:val="0"/>
         <w:spacing w:after="240"/>
         <w:jc w:val="center"/>
       </w:pPr>
@@ -2442,66 +2441,10 @@
     </w:p>
     <w:p>
       <w:pPr>
-        <w:widowControl/>
-        <w:spacing w:after="220" w:line="293" w:lineRule="auto"/>
-      </w:pPr>
-      <w:r>
-        <w:t>Junction tables handle many-to-many relationships. For example, ReservationGuests connects multiple guests with reservations, while ReservationRooms connects reservations with booked rooms.</w:t>
-      </w:r>
-    </w:p>
-    <w:p>
-      <w:pPr>
-        <w:widowControl/>
-        <w:spacing w:after="160"/>
-        <w:jc w:val="center"/>
-      </w:pPr>
-      <w:r>
-        <w:rPr>
-          <w:i/>
-          <w:sz w:val="18"/>
-        </w:rPr>
-        <w:t>The diagram highlights the primary operational relationships and the junction tables used for many-to-many associations.</w:t>
-      </w:r>
-    </w:p>
-    <w:p>
-      <w:pPr>
-        <w:widowControl/>
-        <w:spacing w:after="240"/>
-        <w:jc w:val="center"/>
-      </w:pPr>
-      <w:r>
-        <w:drawing>
-          <wp:inline xmlns:a="http://schemas.openxmlformats.org/drawingml/2006/main" xmlns:pic="http://schemas.openxmlformats.org/drawingml/2006/picture">
-            <wp:extent cx="6400800" cy="4196080"/>
-            <wp:docPr id="1" name="Picture 1"/>
-            <wp:cNvGraphicFramePr>
-              <a:graphicFrameLocks noChangeAspect="1"/>
-            </wp:cNvGraphicFramePr>
-            <a:graphic>
-              <a:graphicData uri="http://schemas.openxmlformats.org/drawingml/2006/picture">
-                <pic:pic>
-                  <pic:nvPicPr>
-                    <pic:cNvPr id="0" name="ER_Diagram.png"/>
-                    <pic:cNvPicPr/>
-                  </pic:nvPicPr>
-                  <pic:blipFill>
-                    <a:blip r:embed="rId11"/>
-                    <a:stretch>
-                      <a:fillRect/>
-                    </a:stretch>
-                  </pic:blipFill>
-                  <pic:spPr>
-                    <a:xfrm>
-                      <a:off x="0" y="0"/>
-                      <a:ext cx="6400800" cy="4196080"/>
-                    </a:xfrm>
-                    <a:prstGeom prst="rect"/>
-                  </pic:spPr>
-                </pic:pic>
-              </a:graphicData>
-            </a:graphic>
-          </wp:inline>
-        </w:drawing>
+        <w:spacing w:before="40" w:after="200"/>
+      </w:pPr>
+      <w:r>
+        <w:t>Junction tables handle many-to-many relationships. ReservationGuests connects guests with reservations, ReservationRooms connects reservations with booked rooms, RoomAmenities links rooms with amenities, and ReservationSpecialRequests links reservations with special requests.</w:t>
       </w:r>
     </w:p>
     <w:p>

</xml_diff>